<commit_message>
Vaeschanan 5783 Full Sefer
</commit_message>
<xml_diff>
--- a/Files/05 - Devarim/02 - Vaeschanan/5783/Vaeschanan 5783.docx
+++ b/Files/05 - Devarim/02 - Vaeschanan/5783/Vaeschanan 5783.docx
@@ -1553,7 +1553,7 @@
         <w:rPr>
           <w:rFonts w:ascii="Times New Roman" w:hAnsi="Times New Roman" w:cs="Times New Roman"/>
         </w:rPr>
-        <w:t>, not</w:t>
+        <w:t xml:space="preserve">, not </w:t>
       </w:r>
       <w:r>
         <w:rPr>
@@ -2276,7 +2276,7 @@
         <w:rPr>
           <w:rFonts w:ascii="Times New Roman" w:hAnsi="Times New Roman" w:cs="Times New Roman"/>
         </w:rPr>
-        <w:t xml:space="preserve"> better, and we will indeed be</w:t>
+        <w:t xml:space="preserve"> better, and we will indeed be </w:t>
       </w:r>
       <w:r>
         <w:rPr>

</xml_diff>